<commit_message>
actualiza informe final fase 2
</commit_message>
<xml_diff>
--- a/Fase 2/Evidencias Grupales/PTY4478 APT2.0 FASE 2 Informe Final.docx
+++ b/Fase 2/Evidencias Grupales/PTY4478 APT2.0 FASE 2 Informe Final.docx
@@ -811,44 +811,7 @@
                 <w:szCs w:val="20"/>
                 <w:lang w:eastAsia="es-CL"/>
               </w:rPr>
-              <w:t>La relevancia de este proyecto en el campo laboral de la informática radica en la aplicación de tecnologías de desarrollo web para automatizar procesos, mejorar la experiencia de usuario y optimizar la gestión de información dentro de una organización.</w:t>
-            </w:r>
-          </w:p>
-          <w:p>
-            <w:pPr>
-              <w:jc w:val="both"/>
-              <w:rPr>
-                <w:rFonts w:ascii="Calibri" w:hAnsi="Calibri" w:cs="Arial"/>
-                <w:iCs/>
-                <w:color w:val="548DD4"/>
-                <w:sz w:val="20"/>
-                <w:szCs w:val="20"/>
-                <w:lang w:eastAsia="es-CL"/>
-              </w:rPr>
-            </w:pPr>
-          </w:p>
-          <w:p>
-            <w:pPr>
-              <w:jc w:val="both"/>
-              <w:rPr>
-                <w:rFonts w:ascii="Calibri" w:hAnsi="Calibri" w:cs="Arial"/>
-                <w:iCs/>
-                <w:color w:val="548DD4"/>
-                <w:sz w:val="20"/>
-                <w:szCs w:val="20"/>
-                <w:lang w:eastAsia="es-CL"/>
-              </w:rPr>
-            </w:pPr>
-            <w:r>
-              <w:rPr>
-                <w:rFonts w:ascii="Calibri" w:hAnsi="Calibri" w:cs="Arial"/>
-                <w:iCs/>
-                <w:color w:val="548DD4"/>
-                <w:sz w:val="20"/>
-                <w:szCs w:val="20"/>
-                <w:lang w:eastAsia="es-CL"/>
-              </w:rPr>
-              <w:t xml:space="preserve"> Durante el desarrollo del proyecto utilicé competencias relacionadas con:</w:t>
+              <w:t>Durante el desarrollo del proyecto utilicé competencias relacionadas con:</w:t>
             </w:r>
           </w:p>
           <w:p>
@@ -906,18 +869,7 @@
                 <w:szCs w:val="20"/>
                 <w:lang w:eastAsia="es-CL"/>
               </w:rPr>
-              <w:t>Desarrollo</w:t>
-            </w:r>
-            <w:r>
-              <w:rPr>
-                <w:rFonts w:ascii="Calibri" w:hAnsi="Calibri" w:cs="Arial"/>
-                <w:iCs/>
-                <w:color w:val="548DD4"/>
-                <w:sz w:val="20"/>
-                <w:szCs w:val="20"/>
-                <w:lang w:eastAsia="es-CL"/>
-              </w:rPr>
-              <w:t xml:space="preserve"> de aplicaciones web utilizando HTML, CSS y JavaScript.</w:t>
+              <w:t>Desarrollo de aplicaciones web utilizando HTML, CSS y JavaScript.</w:t>
             </w:r>
           </w:p>
           <w:p>
@@ -946,18 +898,7 @@
                 <w:szCs w:val="20"/>
                 <w:lang w:eastAsia="es-CL"/>
               </w:rPr>
-              <w:t>Implementación</w:t>
-            </w:r>
-            <w:r>
-              <w:rPr>
-                <w:rFonts w:ascii="Calibri" w:hAnsi="Calibri" w:cs="Arial"/>
-                <w:iCs/>
-                <w:color w:val="548DD4"/>
-                <w:sz w:val="20"/>
-                <w:szCs w:val="20"/>
-                <w:lang w:eastAsia="es-CL"/>
-              </w:rPr>
-              <w:t xml:space="preserve"> de lógica de negocio mediante Node.js.</w:t>
+              <w:t>Implementación de lógica de negocio mediante Node.js.</w:t>
             </w:r>
           </w:p>
           <w:p>
@@ -986,81 +927,7 @@
                 <w:szCs w:val="20"/>
                 <w:lang w:eastAsia="es-CL"/>
               </w:rPr>
-              <w:t>Gestión</w:t>
-            </w:r>
-            <w:r>
-              <w:rPr>
-                <w:rFonts w:ascii="Calibri" w:hAnsi="Calibri" w:cs="Arial"/>
-                <w:iCs/>
-                <w:color w:val="548DD4"/>
-                <w:sz w:val="20"/>
-                <w:szCs w:val="20"/>
-                <w:lang w:eastAsia="es-CL"/>
-              </w:rPr>
-              <w:t xml:space="preserve"> y manipulación de bases de datos SQLite</w:t>
-            </w:r>
-          </w:p>
-          <w:p>
-            <w:pPr>
-              <w:jc w:val="both"/>
-              <w:rPr>
-                <w:rFonts w:ascii="Calibri" w:hAnsi="Calibri" w:cs="Arial"/>
-                <w:iCs/>
-                <w:color w:val="548DD4"/>
-                <w:sz w:val="20"/>
-                <w:szCs w:val="20"/>
-                <w:lang w:eastAsia="es-CL"/>
-              </w:rPr>
-            </w:pPr>
-          </w:p>
-          <w:p>
-            <w:pPr>
-              <w:jc w:val="both"/>
-              <w:rPr>
-                <w:rFonts w:ascii="Calibri" w:hAnsi="Calibri" w:cs="Arial"/>
-                <w:iCs/>
-                <w:color w:val="548DD4"/>
-                <w:sz w:val="20"/>
-                <w:szCs w:val="20"/>
-                <w:lang w:eastAsia="es-CL"/>
-              </w:rPr>
-            </w:pPr>
-          </w:p>
-          <w:p>
-            <w:pPr>
-              <w:jc w:val="both"/>
-              <w:rPr>
-                <w:rFonts w:ascii="Calibri" w:hAnsi="Calibri" w:cs="Arial"/>
-                <w:iCs/>
-                <w:color w:val="548DD4"/>
-                <w:sz w:val="20"/>
-                <w:szCs w:val="20"/>
-                <w:lang w:eastAsia="es-CL"/>
-              </w:rPr>
-            </w:pPr>
-          </w:p>
-          <w:p>
-            <w:pPr>
-              <w:jc w:val="both"/>
-              <w:rPr>
-                <w:rFonts w:ascii="Calibri" w:hAnsi="Calibri" w:cs="Arial"/>
-                <w:iCs/>
-                <w:color w:val="548DD4"/>
-                <w:sz w:val="20"/>
-                <w:szCs w:val="20"/>
-                <w:lang w:eastAsia="es-CL"/>
-              </w:rPr>
-            </w:pPr>
-            <w:r>
-              <w:rPr>
-                <w:rFonts w:ascii="Calibri" w:hAnsi="Calibri" w:cs="Arial"/>
-                <w:iCs/>
-                <w:color w:val="548DD4"/>
-                <w:sz w:val="20"/>
-                <w:szCs w:val="20"/>
-                <w:lang w:eastAsia="es-CL"/>
-              </w:rPr>
-              <w:t>Este proyecto se relaciona directamente con mis intereses profesionales en el área de desarrollo de software y desarrollo web. Me permitió aplicar conocimientos adquiridos durante la carrera en un caso real, participando en el diseño, implementación y gestión de una solución informática orientada a mejorar procesos de negocio. Además, fortaleció mis habilidades en programación, bases de datos y desarrollo de aplicaciones</w:t>
+              <w:t>Gestión y manipulación de bases de datos SQLite</w:t>
             </w:r>
           </w:p>
           <w:p>
@@ -1101,7 +968,6 @@
                 <w:color w:val="1F4E79" w:themeColor="accent1" w:themeShade="80"/>
                 <w:sz w:val="18"/>
               </w:rPr>
-              <w:lastRenderedPageBreak/>
               <w:t xml:space="preserve">2. Objetivos </w:t>
             </w:r>
           </w:p>
@@ -1173,18 +1039,7 @@
                 <w:szCs w:val="20"/>
                 <w:lang w:eastAsia="es-CL"/>
               </w:rPr>
-              <w:t>Objetivos Específicos</w:t>
-            </w:r>
-            <w:r>
-              <w:rPr>
-                <w:rFonts w:ascii="Calibri" w:hAnsi="Calibri" w:cs="Arial"/>
-                <w:iCs/>
-                <w:color w:val="548DD4"/>
-                <w:sz w:val="20"/>
-                <w:szCs w:val="20"/>
-                <w:lang w:eastAsia="es-CL"/>
-              </w:rPr>
-              <w:t>:</w:t>
+              <w:t>Objetivos Específicos:</w:t>
             </w:r>
           </w:p>
           <w:p>
@@ -1212,18 +1067,7 @@
                 <w:szCs w:val="20"/>
                 <w:lang w:eastAsia="es-CL"/>
               </w:rPr>
-              <w:t>Analizar</w:t>
-            </w:r>
-            <w:r>
-              <w:rPr>
-                <w:rFonts w:ascii="Calibri" w:hAnsi="Calibri" w:cs="Arial"/>
-                <w:iCs/>
-                <w:color w:val="548DD4"/>
-                <w:sz w:val="20"/>
-                <w:szCs w:val="20"/>
-                <w:lang w:eastAsia="es-CL"/>
-              </w:rPr>
-              <w:t xml:space="preserve"> los requerimientos y necesidades del salón de belleza para definir las funcionalidades del sistema. </w:t>
+              <w:t xml:space="preserve">Analizar los requerimientos y necesidades del salón de belleza para definir las funcionalidades del sistema. </w:t>
             </w:r>
           </w:p>
           <w:p>
@@ -1251,18 +1095,7 @@
                 <w:szCs w:val="20"/>
                 <w:lang w:eastAsia="es-CL"/>
               </w:rPr>
-              <w:t>Diseñar</w:t>
-            </w:r>
-            <w:r>
-              <w:rPr>
-                <w:rFonts w:ascii="Calibri" w:hAnsi="Calibri" w:cs="Arial"/>
-                <w:iCs/>
-                <w:color w:val="548DD4"/>
-                <w:sz w:val="20"/>
-                <w:szCs w:val="20"/>
-                <w:lang w:eastAsia="es-CL"/>
-              </w:rPr>
-              <w:t xml:space="preserve"> una interfaz web intuitiva que permita a los clientes reservar horas de manera sencilla y eficiente. </w:t>
+              <w:t xml:space="preserve">Diseñar una interfaz web intuitiva que permita a los clientes reservar horas de manera sencilla y eficiente. </w:t>
             </w:r>
           </w:p>
           <w:p>
@@ -1290,18 +1123,7 @@
                 <w:szCs w:val="20"/>
                 <w:lang w:eastAsia="es-CL"/>
               </w:rPr>
-              <w:t xml:space="preserve"> Implementar</w:t>
-            </w:r>
-            <w:r>
-              <w:rPr>
-                <w:rFonts w:ascii="Calibri" w:hAnsi="Calibri" w:cs="Arial"/>
-                <w:iCs/>
-                <w:color w:val="548DD4"/>
-                <w:sz w:val="20"/>
-                <w:szCs w:val="20"/>
-                <w:lang w:eastAsia="es-CL"/>
-              </w:rPr>
-              <w:t xml:space="preserve"> un sistema de almacenamiento de datos utilizando una base de datos SQLite para gestionar clientes, servicios y reservas.</w:t>
+              <w:t xml:space="preserve"> Implementar un sistema de almacenamiento de datos utilizando una base de datos SQLite para gestionar clientes, servicios y reservas.</w:t>
             </w:r>
           </w:p>
           <w:p>
@@ -1354,6 +1176,7 @@
                 <w:color w:val="1F4E79" w:themeColor="accent1" w:themeShade="80"/>
                 <w:sz w:val="18"/>
               </w:rPr>
+              <w:lastRenderedPageBreak/>
               <w:t>3. Metodología</w:t>
             </w:r>
           </w:p>
@@ -1544,18 +1367,7 @@
                 <w:szCs w:val="20"/>
                 <w:lang w:eastAsia="es-CL"/>
               </w:rPr>
-              <w:t>Levantamiento</w:t>
-            </w:r>
-            <w:r>
-              <w:rPr>
-                <w:rFonts w:ascii="Calibri" w:hAnsi="Calibri" w:cs="Arial"/>
-                <w:iCs/>
-                <w:color w:val="548DD4"/>
-                <w:sz w:val="20"/>
-                <w:szCs w:val="20"/>
-                <w:lang w:eastAsia="es-CL"/>
-              </w:rPr>
-              <w:t xml:space="preserve"> y análisis de requerimientos: Se identificaron las necesidades del salón de belleza y las funcionalidades que debía incluir el sistema, tales como la reserva de horas, la gestión de clientes y la administración de servicios.</w:t>
+              <w:t>Levantamiento y análisis de requerimientos: Se identificaron las necesidades del salón de belleza y las funcionalidades que debía incluir el sistema, tales como la reserva de horas, la gestión de clientes y la administración de servicios.</w:t>
             </w:r>
           </w:p>
           <w:p>
@@ -1596,18 +1408,7 @@
                 <w:szCs w:val="20"/>
                 <w:lang w:eastAsia="es-CL"/>
               </w:rPr>
-              <w:t>Diseño</w:t>
-            </w:r>
-            <w:r>
-              <w:rPr>
-                <w:rFonts w:ascii="Calibri" w:hAnsi="Calibri" w:cs="Arial"/>
-                <w:iCs/>
-                <w:color w:val="548DD4"/>
-                <w:sz w:val="20"/>
-                <w:szCs w:val="20"/>
-                <w:lang w:eastAsia="es-CL"/>
-              </w:rPr>
-              <w:t xml:space="preserve"> de la solución: Se definió la estructura de la aplicación, el diseño de la interfaz de usuario y la organización de la base de datos para almacenar la información de manera eficiente. </w:t>
+              <w:t xml:space="preserve">Diseño de la solución: Se definió la estructura de la aplicación, el diseño de la interfaz de usuario y la organización de la base de datos para almacenar la información de manera eficiente. </w:t>
             </w:r>
           </w:p>
           <w:p>
@@ -1648,18 +1449,7 @@
                 <w:szCs w:val="20"/>
                 <w:lang w:eastAsia="es-CL"/>
               </w:rPr>
-              <w:t>Desarrollo</w:t>
-            </w:r>
-            <w:r>
-              <w:rPr>
-                <w:rFonts w:ascii="Calibri" w:hAnsi="Calibri" w:cs="Arial"/>
-                <w:iCs/>
-                <w:color w:val="548DD4"/>
-                <w:sz w:val="20"/>
-                <w:szCs w:val="20"/>
-                <w:lang w:eastAsia="es-CL"/>
-              </w:rPr>
-              <w:t xml:space="preserve"> de la aplicación web: Se implementaron las distintas funcionalidades utilizando tecnologías web como HTML, CSS, JavaScript y Node.js, permitiendo la interacción entre los usuarios y el sistema. </w:t>
+              <w:t xml:space="preserve">Desarrollo de la aplicación web: Se implementaron las distintas funcionalidades utilizando tecnologías web como HTML, CSS, JavaScript y Node.js, permitiendo la interacción entre los usuarios y el sistema. </w:t>
             </w:r>
           </w:p>
           <w:p>
@@ -1696,7 +1486,6 @@
                 <w:szCs w:val="20"/>
                 <w:lang w:eastAsia="es-CL"/>
               </w:rPr>
-              <w:lastRenderedPageBreak/>
               <w:t xml:space="preserve">                </w:t>
             </w:r>
             <w:r>
@@ -1708,18 +1497,7 @@
                 <w:szCs w:val="20"/>
                 <w:lang w:eastAsia="es-CL"/>
               </w:rPr>
-              <w:t>Implementación</w:t>
-            </w:r>
-            <w:r>
-              <w:rPr>
-                <w:rFonts w:ascii="Calibri" w:hAnsi="Calibri" w:cs="Arial"/>
-                <w:iCs/>
-                <w:color w:val="548DD4"/>
-                <w:sz w:val="20"/>
-                <w:szCs w:val="20"/>
-                <w:lang w:eastAsia="es-CL"/>
-              </w:rPr>
-              <w:t xml:space="preserve"> de la base de datos: Se configuró una base de datos SQLite </w:t>
+              <w:t xml:space="preserve">Implementación de la base de datos: Se configuró una base de datos SQLite </w:t>
             </w:r>
             <w:r>
               <w:rPr>
@@ -1784,18 +1562,7 @@
                 <w:szCs w:val="20"/>
                 <w:lang w:eastAsia="es-CL"/>
               </w:rPr>
-              <w:t>Pruebas</w:t>
-            </w:r>
-            <w:r>
-              <w:rPr>
-                <w:rFonts w:ascii="Calibri" w:hAnsi="Calibri" w:cs="Arial"/>
-                <w:iCs/>
-                <w:color w:val="548DD4"/>
-                <w:sz w:val="20"/>
-                <w:szCs w:val="20"/>
-                <w:lang w:eastAsia="es-CL"/>
-              </w:rPr>
-              <w:t xml:space="preserve"> y corrección de errores: Se realizaron pruebas funcionales para verificar el correcto funcionamiento del sistema, identificando y corrigiendo errores detectados durante el proceso</w:t>
+              <w:t>Pruebas y corrección de errores: Se realizaron pruebas funcionales para verificar el correcto funcionamiento del sistema, identificando y corrigiendo errores detectados durante el proceso</w:t>
             </w:r>
             <w:proofErr w:type="gramStart"/>
             <w:r>
@@ -1860,18 +1627,7 @@
                 <w:szCs w:val="20"/>
                 <w:lang w:eastAsia="es-CL"/>
               </w:rPr>
-              <w:t>Validación</w:t>
-            </w:r>
-            <w:r>
-              <w:rPr>
-                <w:rFonts w:ascii="Calibri" w:hAnsi="Calibri" w:cs="Arial"/>
-                <w:iCs/>
-                <w:color w:val="548DD4"/>
-                <w:sz w:val="20"/>
-                <w:szCs w:val="20"/>
-                <w:lang w:eastAsia="es-CL"/>
-              </w:rPr>
-              <w:t xml:space="preserve"> final del sistema: Se comprobó que todas las funcionalidades cumplieran con los requisitos establecidos y que la aplicación estuviera preparada para ser utilizada como solución al problema identificado.</w:t>
+              <w:t>Validación final del sistema: Se comprobó que todas las funcionalidades cumplieran con los requisitos establecidos y que la aplicación estuviera preparada para ser utilizada como solución al problema identificado.</w:t>
             </w:r>
           </w:p>
           <w:p>
@@ -1922,18 +1678,19 @@
                 <w:szCs w:val="20"/>
                 <w:lang w:eastAsia="es-CL"/>
               </w:rPr>
-              <w:t xml:space="preserve">Durante el desarrollo de mi Proyecto APT, me ayudaron los conocimientos adquiridos a lo largo de la carrera en áreas como programación, desarrollo web y bases de datos. También fue de gran utilidad el uso de herramientas como Visual Studio Code, GitHub y SQLite, ya que facilitaron la programación, organización y respaldo del proyecto. Además, la documentación disponible en Internet y el apoyo de docentes permitieron resolver dudas técnicas y avanzar de manera más </w:t>
-            </w:r>
-            <w:r>
-              <w:rPr>
-                <w:rFonts w:ascii="Calibri" w:hAnsi="Calibri" w:cs="Arial"/>
-                <w:iCs/>
-                <w:color w:val="548DD4"/>
-                <w:sz w:val="20"/>
-                <w:szCs w:val="20"/>
-                <w:lang w:eastAsia="es-CL"/>
-              </w:rPr>
-              <w:t xml:space="preserve">eficiente. </w:t>
+              <w:t xml:space="preserve">Durante el desarrollo de mi Proyecto APT, me ayudaron los conocimientos adquiridos a lo largo de la carrera en áreas como programación, desarrollo web y bases de datos. </w:t>
+            </w:r>
+            <w:r>
+              <w:rPr>
+                <w:rFonts w:ascii="Calibri" w:hAnsi="Calibri" w:cs="Arial"/>
+                <w:iCs/>
+                <w:color w:val="548DD4"/>
+                <w:sz w:val="20"/>
+                <w:szCs w:val="20"/>
+                <w:lang w:eastAsia="es-CL"/>
+              </w:rPr>
+              <w:lastRenderedPageBreak/>
+              <w:t xml:space="preserve">También fue de gran utilidad el uso de herramientas como Visual Studio Code, GitHub y SQLite, ya que facilitaron la programación, organización y respaldo del proyecto. Además, la documentación disponible en Internet y el apoyo de docentes permitieron resolver dudas técnicas y avanzar de manera más eficiente. </w:t>
             </w:r>
           </w:p>
           <w:p>
@@ -2259,6 +2016,7 @@
                 <w:b/>
                 <w:noProof/>
               </w:rPr>
+              <w:lastRenderedPageBreak/>
               <w:drawing>
                 <wp:inline distT="0" distB="0" distL="0" distR="0" wp14:anchorId="6455F7F1" wp14:editId="2EA36389">
                   <wp:extent cx="3064319" cy="1592960"/>
@@ -2457,7 +2215,6 @@
                 <w:b/>
                 <w:noProof/>
               </w:rPr>
-              <w:lastRenderedPageBreak/>
               <w:drawing>
                 <wp:inline distT="0" distB="0" distL="0" distR="0" wp14:anchorId="19565976" wp14:editId="04E93395">
                   <wp:extent cx="3034899" cy="1610934"/>
@@ -2721,6 +2478,7 @@
                 <w:b/>
                 <w:noProof/>
               </w:rPr>
+              <w:lastRenderedPageBreak/>
               <w:drawing>
                 <wp:inline distT="0" distB="0" distL="0" distR="0" wp14:anchorId="306A75F6" wp14:editId="4F71FFD9">
                   <wp:extent cx="3046614" cy="1452480"/>
@@ -3044,7 +2802,6 @@
                 <w:b/>
                 <w:noProof/>
               </w:rPr>
-              <w:lastRenderedPageBreak/>
               <w:drawing>
                 <wp:inline distT="0" distB="0" distL="0" distR="0" wp14:anchorId="4882C01C" wp14:editId="63EBBB14">
                   <wp:extent cx="3083732" cy="1767024"/>
@@ -3155,7 +2912,7 @@
                 <w:noProof/>
               </w:rPr>
               <w:drawing>
-                <wp:inline distT="0" distB="0" distL="0" distR="0" wp14:anchorId="4AE32BAF" wp14:editId="6740798D">
+                <wp:inline distT="0" distB="0" distL="0" distR="0" wp14:anchorId="4AE32BAF" wp14:editId="067A69B3">
                   <wp:extent cx="1886300" cy="2064328"/>
                   <wp:effectExtent l="0" t="0" r="0" b="0"/>
                   <wp:docPr id="1677352609" name="Imagen 19"/>
@@ -3448,7 +3205,6 @@
                 <w:szCs w:val="20"/>
                 <w:lang w:eastAsia="es-CL"/>
               </w:rPr>
-              <w:lastRenderedPageBreak/>
               <w:t>Luego de finalizar mi Proyecto APT, mis intereses profesionales se mantienen alineados con los que planteé al inicio de la asignatura. Sin embargo, la experiencia fortaleció mi interés por seguir especializándome en desarrollo web, bases de datos y creación de soluciones tecnológicas orientadas a mejorar procesos dentro de las organizaciones.</w:t>
             </w:r>
           </w:p>
@@ -3797,7 +3553,6 @@
                 <w:sz w:val="28"/>
                 <w:szCs w:val="28"/>
               </w:rPr>
-              <w:lastRenderedPageBreak/>
               <w:t>2</w:t>
             </w:r>
             <w:r>
@@ -4459,7 +4214,18 @@
                 <w:szCs w:val="18"/>
                 <w:lang w:eastAsia="es-CL"/>
               </w:rPr>
-              <w:t xml:space="preserve"> Proyecto APT que se sitúa en un contexto real o simulado semejante al que me podría enfrentar en el área de desempeño seleccionada.</w:t>
+              <w:t xml:space="preserve"> Proyecto APT que se sitúa en un contexto real o simulado semejante al que me podría enfrentar en el área de </w:t>
+            </w:r>
+            <w:r>
+              <w:rPr>
+                <w:rFonts w:ascii="Calibri" w:eastAsia="Calibri" w:hAnsi="Calibri" w:cs="Calibri"/>
+                <w:color w:val="767171" w:themeColor="background2" w:themeShade="80"/>
+                <w:sz w:val="18"/>
+                <w:szCs w:val="18"/>
+                <w:lang w:eastAsia="es-CL"/>
+              </w:rPr>
+              <w:lastRenderedPageBreak/>
+              <w:t>desempeño seleccionada.</w:t>
             </w:r>
           </w:p>
         </w:tc>
@@ -4487,6 +4253,7 @@
                 <w:szCs w:val="18"/>
                 <w:lang w:eastAsia="es-CL"/>
               </w:rPr>
+              <w:lastRenderedPageBreak/>
               <w:t>Desarrollamos un Proyecto APT que requiere algunas modificaciones para situarse en un contexto real o simulado del área de desempeño seleccionada.</w:t>
             </w:r>
           </w:p>
@@ -4515,7 +4282,18 @@
                 <w:szCs w:val="18"/>
                 <w:lang w:eastAsia="es-CL"/>
               </w:rPr>
-              <w:t>Desarrollamos un Proyecto APT que requiere de modificaciones relevantes para situarse en un contexto real o simulado del área de desempeño seleccionada.</w:t>
+              <w:t xml:space="preserve">Desarrollamos un Proyecto APT que requiere de modificaciones relevantes para situarse en un contexto real o simulado del área </w:t>
+            </w:r>
+            <w:r>
+              <w:rPr>
+                <w:rFonts w:ascii="Calibri" w:eastAsia="Calibri" w:hAnsi="Calibri" w:cs="Calibri"/>
+                <w:color w:val="767171" w:themeColor="background2" w:themeShade="80"/>
+                <w:sz w:val="18"/>
+                <w:szCs w:val="18"/>
+                <w:lang w:eastAsia="es-CL"/>
+              </w:rPr>
+              <w:lastRenderedPageBreak/>
+              <w:t>de desempeño seleccionada.</w:t>
             </w:r>
           </w:p>
         </w:tc>
@@ -4543,6 +4321,7 @@
                 <w:szCs w:val="18"/>
                 <w:lang w:eastAsia="es-CL"/>
               </w:rPr>
+              <w:lastRenderedPageBreak/>
               <w:t>Desarrollamos un Proyecto APT que no se sitúa en un contexto real o simulado del área de desempeño seleccionada.</w:t>
             </w:r>
           </w:p>
@@ -4992,7 +4771,6 @@
                 <w:szCs w:val="18"/>
                 <w:lang w:eastAsia="es-CL"/>
               </w:rPr>
-              <w:lastRenderedPageBreak/>
               <w:t>Metodología</w:t>
             </w:r>
           </w:p>
@@ -5629,6 +5407,7 @@
                 <w:szCs w:val="18"/>
                 <w:lang w:eastAsia="es-CL"/>
               </w:rPr>
+              <w:lastRenderedPageBreak/>
               <w:t>Retroalimentación</w:t>
             </w:r>
           </w:p>
@@ -5948,18 +5727,7 @@
                 <w:szCs w:val="18"/>
                 <w:lang w:eastAsia="es-CL"/>
               </w:rPr>
-              <w:t> Utilizamos la mayoría de las veces un lenguaje técnico y pertinente de mi disciplina, tanto en las presentaciones orales como en el contenido de los documentos formal</w:t>
-            </w:r>
-            <w:r>
-              <w:rPr>
-                <w:rFonts w:ascii="Calibri" w:eastAsia="Calibri" w:hAnsi="Calibri" w:cs="Calibri"/>
-                <w:color w:val="767171"/>
-                <w:sz w:val="18"/>
-                <w:szCs w:val="18"/>
-                <w:lang w:eastAsia="es-CL"/>
-              </w:rPr>
-              <w:lastRenderedPageBreak/>
-              <w:t>es que acompañan esta asignatura. </w:t>
+              <w:t> Utilizamos la mayoría de las veces un lenguaje técnico y pertinente de mi disciplina, tanto en las presentaciones orales como en el contenido de los documentos formales que acompañan esta asignatura. </w:t>
             </w:r>
           </w:p>
         </w:tc>
@@ -5991,7 +5759,6 @@
                 <w:szCs w:val="18"/>
                 <w:lang w:eastAsia="es-CL"/>
               </w:rPr>
-              <w:lastRenderedPageBreak/>
               <w:t>Utilizamos en ocasiones un lenguaje técnico y pertinente de mi disciplina, tanto en las presentaciones orales como en el contenido de los documentos formales que acompañan esta asignatura. </w:t>
             </w:r>
           </w:p>
@@ -6709,7 +6476,18 @@
                 <w:szCs w:val="18"/>
                 <w:lang w:eastAsia="es-CL"/>
               </w:rPr>
-              <w:t xml:space="preserve">12.Realiza un proceso de verificación de la calidad del sistema. </w:t>
+              <w:t xml:space="preserve">12.Realiza un proceso de </w:t>
+            </w:r>
+            <w:r>
+              <w:rPr>
+                <w:rFonts w:ascii="Calibri" w:eastAsia="Calibri" w:hAnsi="Calibri" w:cs="Calibri"/>
+                <w:color w:val="767171" w:themeColor="background2" w:themeShade="80"/>
+                <w:sz w:val="18"/>
+                <w:szCs w:val="18"/>
+                <w:lang w:eastAsia="es-CL"/>
+              </w:rPr>
+              <w:lastRenderedPageBreak/>
+              <w:t xml:space="preserve">verificación de la calidad del sistema. </w:t>
             </w:r>
           </w:p>
         </w:tc>
@@ -6735,7 +6513,19 @@
                 <w:szCs w:val="18"/>
                 <w:lang w:eastAsia="es-CL"/>
               </w:rPr>
-              <w:t xml:space="preserve">Realizamos un proceso de verificación de la calidad del sistema aplicando pruebas funcionales, unitarias o de automatización validando el 100% los requerimientos del proyecto. </w:t>
+              <w:lastRenderedPageBreak/>
+              <w:t xml:space="preserve">Realizamos un proceso de verificación de la </w:t>
+            </w:r>
+            <w:r>
+              <w:rPr>
+                <w:rFonts w:ascii="Calibri" w:eastAsia="Calibri" w:hAnsi="Calibri" w:cs="Calibri"/>
+                <w:color w:val="767171"/>
+                <w:sz w:val="18"/>
+                <w:szCs w:val="18"/>
+                <w:lang w:eastAsia="es-CL"/>
+              </w:rPr>
+              <w:lastRenderedPageBreak/>
+              <w:t xml:space="preserve">calidad del sistema aplicando pruebas funcionales, unitarias o de automatización validando el 100% los requerimientos del proyecto. </w:t>
             </w:r>
           </w:p>
         </w:tc>
@@ -6761,7 +6551,19 @@
                 <w:szCs w:val="18"/>
                 <w:lang w:eastAsia="es-CL"/>
               </w:rPr>
-              <w:t>Realizamos un proceso de verificación de la calidad del sistema aplicando pruebas funcionales, unitarias o de automatización validando más del 60% de  los requerimientos del proyecto</w:t>
+              <w:lastRenderedPageBreak/>
+              <w:t xml:space="preserve">Realizamos un proceso de verificación de la </w:t>
+            </w:r>
+            <w:r>
+              <w:rPr>
+                <w:rFonts w:ascii="Calibri" w:eastAsia="Calibri" w:hAnsi="Calibri" w:cs="Calibri"/>
+                <w:color w:val="767171" w:themeColor="background2" w:themeShade="80"/>
+                <w:sz w:val="18"/>
+                <w:szCs w:val="18"/>
+                <w:lang w:eastAsia="es-CL"/>
+              </w:rPr>
+              <w:lastRenderedPageBreak/>
+              <w:t>calidad del sistema aplicando pruebas funcionales, unitarias o de automatización validando más del 60% de  los requerimientos del proyecto</w:t>
             </w:r>
           </w:p>
         </w:tc>
@@ -6787,7 +6589,19 @@
                 <w:szCs w:val="18"/>
                 <w:lang w:eastAsia="es-CL"/>
               </w:rPr>
-              <w:t>Realizamos un proceso de verificación de la calidad del sistema aplicando pruebas funcionales, unitarias o de automatización validando   menos del 60% requerimientos del proyecto</w:t>
+              <w:lastRenderedPageBreak/>
+              <w:t xml:space="preserve">Realizamos un proceso de verificación de la </w:t>
+            </w:r>
+            <w:r>
+              <w:rPr>
+                <w:rFonts w:ascii="Calibri" w:eastAsia="Calibri" w:hAnsi="Calibri" w:cs="Calibri"/>
+                <w:color w:val="767171"/>
+                <w:sz w:val="18"/>
+                <w:szCs w:val="18"/>
+                <w:lang w:eastAsia="es-CL"/>
+              </w:rPr>
+              <w:lastRenderedPageBreak/>
+              <w:t>calidad del sistema aplicando pruebas funcionales, unitarias o de automatización validando   menos del 60% requerimientos del proyecto</w:t>
             </w:r>
           </w:p>
         </w:tc>
@@ -6813,7 +6627,19 @@
                 <w:szCs w:val="18"/>
                 <w:lang w:eastAsia="es-CL"/>
               </w:rPr>
-              <w:t>No realizamos un proceso de verificación de la calidad del sistema.</w:t>
+              <w:lastRenderedPageBreak/>
+              <w:t xml:space="preserve">No realizamos un proceso de </w:t>
+            </w:r>
+            <w:r>
+              <w:rPr>
+                <w:rFonts w:ascii="Calibri" w:eastAsia="Calibri" w:hAnsi="Calibri" w:cs="Calibri"/>
+                <w:color w:val="767171" w:themeColor="background2" w:themeShade="80"/>
+                <w:sz w:val="18"/>
+                <w:szCs w:val="18"/>
+                <w:lang w:eastAsia="es-CL"/>
+              </w:rPr>
+              <w:lastRenderedPageBreak/>
+              <w:t>verificación de la calidad del sistema.</w:t>
             </w:r>
           </w:p>
         </w:tc>
@@ -11304,6 +11130,7 @@
   <w:style w:type="character" w:default="1" w:styleId="Fuentedeprrafopredeter">
     <w:name w:val="Default Paragraph Font"/>
     <w:uiPriority w:val="1"/>
+    <w:semiHidden/>
     <w:unhideWhenUsed/>
   </w:style>
   <w:style w:type="table" w:default="1" w:styleId="Tablanormal">
@@ -12612,10 +12439,6 @@
 </file>
 
 <file path=customXml/item1.xml><?xml version="1.0" encoding="utf-8"?>
-<b:Sources xmlns:b="http://schemas.openxmlformats.org/officeDocument/2006/bibliography" xmlns="http://schemas.openxmlformats.org/officeDocument/2006/bibliography" SelectedStyle="\APASixthEditionOfficeOnline.xsl" StyleName="APA" Version="6"/>
-</file>
-
-<file path=customXml/item2.xml><?xml version="1.0" encoding="utf-8"?>
 <?mso-contentType ?>
 <FormTemplates xmlns="http://schemas.microsoft.com/sharepoint/v3/contenttype/forms">
   <Display>DocumentLibraryForm</Display>
@@ -12624,13 +12447,11 @@
 </FormTemplates>
 </file>
 
-<file path=customXml/item3.xml><?xml version="1.0" encoding="utf-8"?>
-<p:properties xmlns:p="http://schemas.microsoft.com/office/2006/metadata/properties" xmlns:xsi="http://www.w3.org/2001/XMLSchema-instance" xmlns:pc="http://schemas.microsoft.com/office/infopath/2007/PartnerControls">
-  <documentManagement/>
-</p:properties>
+<file path=customXml/item2.xml><?xml version="1.0" encoding="utf-8"?>
+<b:Sources xmlns:b="http://schemas.openxmlformats.org/officeDocument/2006/bibliography" xmlns="http://schemas.openxmlformats.org/officeDocument/2006/bibliography" SelectedStyle="\APASixthEditionOfficeOnline.xsl" StyleName="APA" Version="6"/>
 </file>
 
-<file path=customXml/item4.xml><?xml version="1.0" encoding="utf-8"?>
+<file path=customXml/item3.xml><?xml version="1.0" encoding="utf-8"?>
 <ct:contentTypeSchema xmlns:ct="http://schemas.microsoft.com/office/2006/metadata/contentType" xmlns:ma="http://schemas.microsoft.com/office/2006/metadata/properties/metaAttributes" ct:_="" ma:_="" ma:contentTypeName="Documento" ma:contentTypeID="0x010100540D93CFA3C06649B648D09825F0F998" ma:contentTypeVersion="6" ma:contentTypeDescription="Crear nuevo documento." ma:contentTypeScope="" ma:versionID="5c2b2473766d38aecfe63858bf132535">
   <xsd:schema xmlns:xsd="http://www.w3.org/2001/XMLSchema" xmlns:xs="http://www.w3.org/2001/XMLSchema" xmlns:p="http://schemas.microsoft.com/office/2006/metadata/properties" xmlns:ns2="02df7497-e9e2-4bdc-bf3a-98b07bb6bf63" xmlns:ns3="0dcc4151-94c2-46e6-979e-e4dc186d1009" targetNamespace="http://schemas.microsoft.com/office/2006/metadata/properties" ma:root="true" ma:fieldsID="9faf397e8da13125d98031af5ffce206" ns2:_="" ns3:_="">
     <xsd:import namespace="02df7497-e9e2-4bdc-bf3a-98b07bb6bf63"/>
@@ -12809,7 +12630,21 @@
 </ct:contentTypeSchema>
 </file>
 
+<file path=customXml/item4.xml><?xml version="1.0" encoding="utf-8"?>
+<p:properties xmlns:p="http://schemas.microsoft.com/office/2006/metadata/properties" xmlns:xsi="http://www.w3.org/2001/XMLSchema-instance" xmlns:pc="http://schemas.microsoft.com/office/infopath/2007/PartnerControls">
+  <documentManagement/>
+</p:properties>
+</file>
+
 <file path=customXml/itemProps1.xml><?xml version="1.0" encoding="utf-8"?>
+<ds:datastoreItem xmlns:ds="http://schemas.openxmlformats.org/officeDocument/2006/customXml" ds:itemID="{DABAA964-10BA-4DBC-ABF2-CDEAC0FAF7AA}">
+  <ds:schemaRefs>
+    <ds:schemaRef ds:uri="http://schemas.microsoft.com/sharepoint/v3/contenttype/forms"/>
+  </ds:schemaRefs>
+</ds:datastoreItem>
+</file>
+
+<file path=customXml/itemProps2.xml><?xml version="1.0" encoding="utf-8"?>
 <ds:datastoreItem xmlns:ds="http://schemas.openxmlformats.org/officeDocument/2006/customXml" ds:itemID="{113600F2-9B25-49FF-9AAC-48E75D12FA81}">
   <ds:schemaRefs>
     <ds:schemaRef ds:uri="http://schemas.openxmlformats.org/officeDocument/2006/bibliography"/>
@@ -12817,24 +12652,7 @@
 </ds:datastoreItem>
 </file>
 
-<file path=customXml/itemProps2.xml><?xml version="1.0" encoding="utf-8"?>
-<ds:datastoreItem xmlns:ds="http://schemas.openxmlformats.org/officeDocument/2006/customXml" ds:itemID="{DABAA964-10BA-4DBC-ABF2-CDEAC0FAF7AA}">
-  <ds:schemaRefs>
-    <ds:schemaRef ds:uri="http://schemas.microsoft.com/sharepoint/v3/contenttype/forms"/>
-  </ds:schemaRefs>
-</ds:datastoreItem>
-</file>
-
 <file path=customXml/itemProps3.xml><?xml version="1.0" encoding="utf-8"?>
-<ds:datastoreItem xmlns:ds="http://schemas.openxmlformats.org/officeDocument/2006/customXml" ds:itemID="{5F1783E3-BA1C-4CA3-8E32-C9B378BBED03}">
-  <ds:schemaRefs>
-    <ds:schemaRef ds:uri="http://schemas.microsoft.com/office/2006/metadata/properties"/>
-    <ds:schemaRef ds:uri="http://schemas.microsoft.com/office/infopath/2007/PartnerControls"/>
-  </ds:schemaRefs>
-</ds:datastoreItem>
-</file>
-
-<file path=customXml/itemProps4.xml><?xml version="1.0" encoding="utf-8"?>
 <ds:datastoreItem xmlns:ds="http://schemas.openxmlformats.org/officeDocument/2006/customXml" ds:itemID="{94B1D32B-7ABE-4839-9F70-60DD30FC5343}">
   <ds:schemaRefs>
     <ds:schemaRef ds:uri="http://schemas.microsoft.com/office/2006/metadata/contentType"/>
@@ -12851,4 +12669,13 @@
     <ds:schemaRef ds:uri="http://schemas.microsoft.com/internal/obd"/>
   </ds:schemaRefs>
 </ds:datastoreItem>
+</file>
+
+<file path=customXml/itemProps4.xml><?xml version="1.0" encoding="utf-8"?>
+<ds:datastoreItem xmlns:ds="http://schemas.openxmlformats.org/officeDocument/2006/customXml" ds:itemID="{5F1783E3-BA1C-4CA3-8E32-C9B378BBED03}">
+  <ds:schemaRefs>
+    <ds:schemaRef ds:uri="http://schemas.microsoft.com/office/2006/metadata/properties"/>
+    <ds:schemaRef ds:uri="http://schemas.microsoft.com/office/infopath/2007/PartnerControls"/>
+  </ds:schemaRefs>
+</ds:datastoreItem>
 </file>
</xml_diff>